<commit_message>
No em dashes anywhere: site copy, engine text, docs, spec document
- Page titles use a colon ('Michigan Wolverines: Season World'); empty values show '-'.
- API responses and SpacetimeDB publishes strip em dashes from live ESPN, news and LLM text.
- README, Devpost draft, research report, demo script, design docs and the spec .docx rewritten.

Co-Authored-By: Claude Opus 5.5 <noreply@anthropic.com>
</commit_message>
<xml_diff>
--- a/docs/SportsWorld_MHacks_2026_Master_Build_Specification.docx
+++ b/docs/SportsWorld_MHacks_2026_Master_Build_Specification.docx
@@ -28,7 +28,7 @@
           <w:color w:val="1F2937"/>
           <w:sz w:val="34"/>
         </w:rPr>
-        <w:t>MHacks 2026 — Complete Product, Research, Technical, and Build Specification</w:t>
+        <w:t>MHacks 2026, Complete Product, Research, Technical, and Build Specification</w:t>
       </w:r>
     </w:p>
     <w:p>
@@ -533,7 +533,7 @@
                 <w:color w:val="00274C"/>
                 <w:sz w:val="19"/>
               </w:rPr>
-              <w:t xml:space="preserve">Priority language — </w:t>
+              <w:t xml:space="preserve">Priority language, </w:t>
             </w:r>
             <w:r>
               <w:rPr>
@@ -2194,7 +2194,7 @@
                 <w:color w:val="00274C"/>
                 <w:sz w:val="19"/>
               </w:rPr>
-              <w:t xml:space="preserve">Research framing — </w:t>
+              <w:t xml:space="preserve">Research framing, </w:t>
             </w:r>
             <w:r>
               <w:rPr>
@@ -5739,7 +5739,7 @@
         <w:keepNext/>
       </w:pPr>
       <w:r>
-        <w:t>6.1 Observation contract — required final form</w:t>
+        <w:t>6.1 Observation contract, required final form</w:t>
       </w:r>
     </w:p>
     <w:p>
@@ -6057,7 +6057,7 @@
                 <w:color w:val="00274C"/>
                 <w:sz w:val="19"/>
               </w:rPr>
-              <w:t xml:space="preserve">Critical leakage rule — </w:t>
+              <w:t xml:space="preserve">Critical leakage rule, </w:t>
             </w:r>
             <w:r>
               <w:rPr>
@@ -8535,7 +8535,7 @@
         <w:keepNext/>
       </w:pPr>
       <w:r>
-        <w:t>9.2 American football — NFL and college football</w:t>
+        <w:t>9.2 American football, NFL and college football</w:t>
       </w:r>
     </w:p>
     <w:p>
@@ -8682,7 +8682,7 @@
         <w:keepNext/>
       </w:pPr>
       <w:r>
-        <w:t>9.3 Basketball — NBA and college basketball</w:t>
+        <w:t>9.3 Basketball, NBA and college basketball</w:t>
       </w:r>
     </w:p>
     <w:p>
@@ -8829,7 +8829,7 @@
         <w:keepNext/>
       </w:pPr>
       <w:r>
-        <w:t>9.4 Hockey — NHL and college hockey</w:t>
+        <w:t>9.4 Hockey, NHL and college hockey</w:t>
       </w:r>
     </w:p>
     <w:p>
@@ -11119,7 +11119,7 @@
                 <w:color w:val="00274C"/>
                 <w:sz w:val="19"/>
               </w:rPr>
-              <w:t xml:space="preserve">Replace before final research claim — </w:t>
+              <w:t xml:space="preserve">Replace before final research claim, </w:t>
             </w:r>
             <w:r>
               <w:rPr>
@@ -16294,7 +16294,7 @@
         <w:keepNext/>
       </w:pPr>
       <w:r>
-        <w:t>17.2 Screen 1 — Cross-sport overview</w:t>
+        <w:t>17.2 Screen 1, Cross-sport overview</w:t>
       </w:r>
     </w:p>
     <w:p>
@@ -16373,7 +16373,7 @@
         <w:keepNext/>
       </w:pPr>
       <w:r>
-        <w:t>17.3 Screen 2 — Live Event Terminal (hero screen)</w:t>
+        <w:t>17.3 Screen 2, Live Event Terminal (hero screen)</w:t>
       </w:r>
     </w:p>
     <w:p>
@@ -17177,7 +17177,7 @@
         <w:keepNext/>
       </w:pPr>
       <w:r>
-        <w:t>17.5 Screen 3 — Quant / Research</w:t>
+        <w:t>17.5 Screen 3, Quant / Research</w:t>
       </w:r>
     </w:p>
     <w:p>
@@ -17340,7 +17340,7 @@
         <w:keepNext/>
       </w:pPr>
       <w:r>
-        <w:t>17.6 Screen 4 — Model &amp; Data Provenance</w:t>
+        <w:t>17.6 Screen 4, Model &amp; Data Provenance</w:t>
       </w:r>
     </w:p>
     <w:p>
@@ -18836,7 +18836,7 @@
                 <w:color w:val="00274C"/>
                 <w:sz w:val="19"/>
               </w:rPr>
-              <w:t xml:space="preserve">Sponsor challenge rule — </w:t>
+              <w:t xml:space="preserve">Sponsor challenge rule, </w:t>
             </w:r>
             <w:r>
               <w:rPr>
@@ -23737,7 +23737,7 @@
         <w:keepNext/>
       </w:pPr>
       <w:r>
-        <w:t>25. Definition of Done — master checklist</w:t>
+        <w:t>25. Definition of Done, master checklist</w:t>
       </w:r>
     </w:p>
     <w:p>
@@ -26853,7 +26853,7 @@
         <w:keepNext/>
       </w:pPr>
       <w:r>
-        <w:t>Appendix A — Detailed example observation schemas</w:t>
+        <w:t>Appendix A, Detailed example observation schemas</w:t>
       </w:r>
     </w:p>
     <w:p>
@@ -27699,7 +27699,7 @@
         <w:keepNext/>
       </w:pPr>
       <w:r>
-        <w:t>Appendix B — Feature matrices by sport family</w:t>
+        <w:t>Appendix B, Feature matrices by sport family</w:t>
       </w:r>
     </w:p>
     <w:tbl>
@@ -28257,7 +28257,7 @@
         <w:keepNext/>
       </w:pPr>
       <w:r>
-        <w:t>Appendix C — Backtest report schema</w:t>
+        <w:t>Appendix C, Backtest report schema</w:t>
       </w:r>
     </w:p>
     <w:p>
@@ -28641,7 +28641,7 @@
         <w:keepNext/>
       </w:pPr>
       <w:r>
-        <w:t>Appendix D — Data and model version naming</w:t>
+        <w:t>Appendix D, Data and model version naming</w:t>
       </w:r>
     </w:p>
     <w:p>
@@ -28734,7 +28734,7 @@
         <w:keepNext/>
       </w:pPr>
       <w:r>
-        <w:t>Appendix E — Post-MHacks extension roadmap</w:t>
+        <w:t>Appendix E, Post-MHacks extension roadmap</w:t>
       </w:r>
     </w:p>
     <w:p>
@@ -28927,7 +28927,7 @@
         <w:keepNext/>
       </w:pPr>
       <w:r>
-        <w:t>Appendix F — Final build principle</w:t>
+        <w:t>Appendix F, Final build principle</w:t>
       </w:r>
     </w:p>
     <w:tbl>
@@ -28960,7 +28960,7 @@
                 <w:color w:val="00274C"/>
                 <w:sz w:val="19"/>
               </w:rPr>
-              <w:t xml:space="preserve">The bar — </w:t>
+              <w:t xml:space="preserve">The bar, </w:t>
             </w:r>
             <w:r>
               <w:rPr>
@@ -28968,7 +28968,7 @@
                 <w:color w:val="1F2937"/>
                 <w:sz w:val="19"/>
               </w:rPr>
-              <w:t>A judge should be able to ask “What does the model know right now, why did the forecast move, how uncertain is it, how was it evaluated without leakage, and what happens under an alternative assumption?” — and SportsWorld should answer every part from the running system, not from a slide.</w:t>
+              <w:t>A judge should be able to ask “What does the model know right now, why did the forecast move, how uncertain is it, how was it evaluated without leakage, and what happens under an alternative assumption?”, and SportsWorld should answer every part from the running system, not from a slide.</w:t>
             </w:r>
           </w:p>
         </w:tc>

</xml_diff>